<commit_message>
add citation link checker in export lua script
</commit_message>
<xml_diff>
--- a/academic-typora/academic-typora.docx
+++ b/academic-typora/academic-typora.docx
@@ -1043,6 +1043,24 @@
     <w:basedOn w:val="DefaultParagraphFont"/>
     <w:rPr>
       <w:color w:val="1B7F3A"/>
+      <w:u w:val="none"/>
+    </w:rPr>
+  </w:style>
+  <w:style w:type="character" w:customStyle="1" w:styleId="InvalidReference">
+    <w:name w:val="Invalid Reference"/>
+    <w:basedOn w:val="DefaultParagraphFont"/>
+    <w:rPr>
+      <w:color w:val="C00000"/>
+      <w:u w:val="none"/>
+    </w:rPr>
+  </w:style>
+  <w:style w:type="character" w:customStyle="1" w:styleId="UnusedReference">
+    <w:name w:val="Unused Reference"/>
+    <w:basedOn w:val="VerbatimChar"/>
+    <w:rPr>
+      <w:rFonts w:ascii="Courier New" w:hAnsi="Courier New"/>
+      <w:color w:val="C00000"/>
+      <w:sz w:val="20"/>
       <w:u w:val="none"/>
     </w:rPr>
   </w:style>

</xml_diff>